<commit_message>
updated contract by adding features.
</commit_message>
<xml_diff>
--- a/server/src/templates/offer.docx
+++ b/server/src/templates/offer.docx
@@ -467,7 +467,19 @@
             </w:pPr>
             <w:r>
               <w:rPr/>
-              <w:t>{customerContactPerson}</w:t>
+              <w:t>{</w:t>
+            </w:r>
+            <w:r>
+              <w:rPr/>
+              <w:t>customer.salutation</w:t>
+            </w:r>
+            <w:r>
+              <w:rPr/>
+              <w:t xml:space="preserve">} </w:t>
+            </w:r>
+            <w:r>
+              <w:rPr/>
+              <w:t>{customer.lastName}</w:t>
             </w:r>
           </w:p>
         </w:tc>
@@ -516,7 +528,15 @@
             </w:pPr>
             <w:r>
               <w:rPr/>
-              <w:t>{contactPerson}</w:t>
+              <w:t>{</w:t>
+            </w:r>
+            <w:r>
+              <w:rPr/>
+              <w:t>employee.fullName</w:t>
+            </w:r>
+            <w:r>
+              <w:rPr/>
+              <w:t>}</w:t>
             </w:r>
           </w:p>
           <w:p>
@@ -526,7 +546,15 @@
             </w:pPr>
             <w:r>
               <w:rPr/>
-              <w:t>{contactPhone}</w:t>
+              <w:t>{</w:t>
+            </w:r>
+            <w:r>
+              <w:rPr/>
+              <w:t>employee.phone</w:t>
+            </w:r>
+            <w:r>
+              <w:rPr/>
+              <w:t>}</w:t>
             </w:r>
           </w:p>
           <w:p>
@@ -536,7 +564,15 @@
             </w:pPr>
             <w:r>
               <w:rPr/>
-              <w:t>{contactEmail}</w:t>
+              <w:t>{</w:t>
+            </w:r>
+            <w:r>
+              <w:rPr/>
+              <w:t>employee.email</w:t>
+            </w:r>
+            <w:r>
+              <w:rPr/>
+              <w:t>}</w:t>
             </w:r>
           </w:p>
         </w:tc>
@@ -875,7 +911,15 @@
       </w:r>
       <w:r>
         <w:rPr/>
-        <w:t>},</w:t>
+        <w:t xml:space="preserve">} </w:t>
+      </w:r>
+      <w:r>
+        <w:rPr/>
+        <w:t>{customer.lastName}</w:t>
+      </w:r>
+      <w:r>
+        <w:rPr/>
+        <w:t>,</w:t>
       </w:r>
     </w:p>
     <w:p>
@@ -894,7 +938,15 @@
       </w:pPr>
       <w:r>
         <w:rPr/>
-        <w:t>hiermit senden wir Ihnen wie besprochen unser Angebot zur Einrichtung einer SaaS-Backup Lösung für Ihre {products} Umgebung:</w:t>
+        <w:t>hiermit senden wir Ihnen wie besprochen unser Angebot zur Einrichtung einer SaaS-Backup Lösung für Ihre {products.</w:t>
+      </w:r>
+      <w:r>
+        <w:rPr/>
+        <w:t>names</w:t>
+      </w:r>
+      <w:r>
+        <w:rPr/>
+        <w:t>} Umgebung:</w:t>
       </w:r>
     </w:p>
     <w:p>
@@ -913,86 +965,131 @@
       </w:pPr>
       <w:r>
         <w:rPr/>
-        <w:t>{#positions}</w:t>
+        <w:t>{#products.hasOptionals}</w:t>
       </w:r>
     </w:p>
     <w:p>
       <w:pPr>
         <w:pStyle w:val="dignumStandardvor0nach0"/>
-        <w:rPr>
-          <w:lang w:val="zxx" w:eastAsia="zxx" w:bidi="zxx"/>
-        </w:rPr>
-      </w:pPr>
-      <w:r>
-        <w:rPr>
-          <w:lang w:val="zxx" w:eastAsia="zxx" w:bidi="zxx"/>
-        </w:rPr>
-        <w:t>{productName} {contractName} {duration} {quantity} {pricePerUnit} {price12} {price36} {totalPrice}</w:t>
+        <w:rPr/>
+      </w:pPr>
+      <w:r>
+        <w:rPr/>
+        <w:t>{#products.positions}</w:t>
       </w:r>
     </w:p>
     <w:p>
       <w:pPr>
         <w:pStyle w:val="dignumStandardvor0nach0"/>
-        <w:rPr/>
-      </w:pPr>
-      <w:r>
-        <w:rPr/>
-        <w:t>{/positions}</w:t>
+        <w:numPr>
+          <w:ilvl w:val="0"/>
+          <w:numId w:val="7"/>
+        </w:numPr>
+        <w:rPr>
+          <w:b/>
+          <w:bCs/>
+        </w:rPr>
+      </w:pPr>
+      <w:r>
+        <w:rPr>
+          <w:b/>
+          <w:bCs/>
+        </w:rPr>
+        <w:t>Keepit für {name}</w:t>
       </w:r>
     </w:p>
     <w:p>
       <w:pPr>
         <w:pStyle w:val="dignumStandardvor0nach0"/>
+        <w:numPr>
+          <w:ilvl w:val="0"/>
+          <w:numId w:val="8"/>
+        </w:numPr>
         <w:rPr>
-          <w:rFonts w:ascii="JetBrains Mono;Menlo;Monaco;Courier New;monospace;Menlo;Monaco;Courier New;monospace" w:hAnsi="JetBrains Mono;Menlo;Monaco;Courier New;monospace;Menlo;Monaco;Courier New;monospace"/>
           <w:b w:val="false"/>
-          <w:color w:val="0070C1"/>
-          <w:sz w:val="23"/>
-          <w:shd w:fill="FFFFFF" w:val="clear"/>
+          <w:bCs w:val="false"/>
         </w:rPr>
       </w:pPr>
       <w:r>
         <w:rPr>
-          <w:rFonts w:ascii="JetBrains Mono;Menlo;Monaco;Courier New;monospace;Menlo;Monaco;Courier New;monospace" w:hAnsi="JetBrains Mono;Menlo;Monaco;Courier New;monospace;Menlo;Monaco;Courier New;monospace"/>
           <w:b w:val="false"/>
-          <w:color w:val="0070C1"/>
-          <w:sz w:val="23"/>
-          <w:shd w:fill="FFFFFF" w:val="clear"/>
+          <w:bCs w:val="false"/>
         </w:rPr>
+        <w:t xml:space="preserve">Im Vertrag: </w:t>
+      </w:r>
+      <w:r>
+        <w:rPr>
+          <w:b/>
+          <w:bCs/>
+        </w:rPr>
+        <w:t>„{contract.name}“</w:t>
       </w:r>
     </w:p>
     <w:p>
       <w:pPr>
         <w:pStyle w:val="dignumStandardvor0nach0"/>
-        <w:rPr/>
-      </w:pPr>
-      <w:r>
-        <w:rPr/>
-        <w:t>{#positions}</w:t>
+        <w:numPr>
+          <w:ilvl w:val="1"/>
+          <w:numId w:val="8"/>
+        </w:numPr>
+        <w:rPr>
+          <w:b/>
+          <w:bCs/>
+        </w:rPr>
+      </w:pPr>
+      <w:r>
+        <w:rPr>
+          <w:b/>
+          <w:bCs/>
+        </w:rPr>
+        <w:t>Datenaufbewahrung / max. Retention: unlimitiert</w:t>
       </w:r>
     </w:p>
     <w:p>
       <w:pPr>
         <w:pStyle w:val="dignumStandardvor0nach0"/>
-        <w:rPr/>
-      </w:pPr>
-      <w:r>
-        <w:rPr/>
-        <w:t>{label} Keepit für {productName}</w:t>
+        <w:numPr>
+          <w:ilvl w:val="0"/>
+          <w:numId w:val="8"/>
+        </w:numPr>
+        <w:rPr>
+          <w:b/>
+          <w:bCs/>
+        </w:rPr>
+      </w:pPr>
+      <w:r>
+        <w:rPr>
+          <w:b w:val="false"/>
+          <w:bCs w:val="false"/>
+        </w:rPr>
+        <w:t>Vertragslaufzeit:</w:t>
+      </w:r>
+      <w:r>
+        <w:rPr>
+          <w:b/>
+          <w:bCs/>
+        </w:rPr>
+        <w:t xml:space="preserve"> {duration}</w:t>
       </w:r>
     </w:p>
     <w:p>
       <w:pPr>
         <w:pStyle w:val="dignumStandardvor0nach0"/>
-        <w:rPr/>
-      </w:pPr>
-      <w:r>
-        <w:rPr/>
-        <w:t xml:space="preserve">  </w:t>
-      </w:r>
-      <w:r>
-        <w:rPr/>
-        <w:t>Im Vertrag „{contractName}"</w:t>
+        <w:numPr>
+          <w:ilvl w:val="0"/>
+          <w:numId w:val="8"/>
+        </w:numPr>
+        <w:rPr>
+          <w:b w:val="false"/>
+          <w:bCs w:val="false"/>
+        </w:rPr>
+      </w:pPr>
+      <w:r>
+        <w:rPr>
+          <w:b w:val="false"/>
+          <w:bCs w:val="false"/>
+        </w:rPr>
+        <w:t>Zahlungsweise: im Voraus</w:t>
       </w:r>
     </w:p>
     <w:p>
@@ -1002,11 +1099,6 @@
       </w:pPr>
       <w:r>
         <w:rPr/>
-        <w:t xml:space="preserve">    </w:t>
-      </w:r>
-      <w:r>
-        <w:rPr/>
-        <w:t>{#features}{.}{/features}</w:t>
       </w:r>
     </w:p>
     <w:p>
@@ -1016,11 +1108,7 @@
       </w:pPr>
       <w:r>
         <w:rPr/>
-        <w:t xml:space="preserve">  </w:t>
-      </w:r>
-      <w:r>
-        <w:rPr/>
-        <w:t>Vertragslaufzeit: {duration} Monate</w:t>
+        <w:t>{/products.positions}</w:t>
       </w:r>
     </w:p>
     <w:p>
@@ -1030,21 +1118,7 @@
       </w:pPr>
       <w:r>
         <w:rPr/>
-        <w:t xml:space="preserve">  </w:t>
-      </w:r>
-      <w:r>
-        <w:rPr/>
-        <w:t>Zahlungsweise: im Voraus</w:t>
-      </w:r>
-    </w:p>
-    <w:p>
-      <w:pPr>
-        <w:pStyle w:val="dignumStandardvor0nach0"/>
-        <w:rPr/>
-      </w:pPr>
-      <w:r>
-        <w:rPr/>
-        <w:t>{/positions}</w:t>
+        <w:t>{/products.hasOptionals}</w:t>
       </w:r>
     </w:p>
     <w:p>
@@ -5801,6 +5875,262 @@
       <w:rPr/>
     </w:lvl>
   </w:abstractNum>
+  <w:abstractNum w:abstractNumId="7">
+    <w:lvl w:ilvl="0">
+      <w:start w:val="1"/>
+      <w:numFmt w:val="upperLetter"/>
+      <w:lvlText w:val="%1)"/>
+      <w:lvlJc w:val="start"/>
+      <w:pPr>
+        <w:tabs>
+          <w:tab w:val="num" w:pos="720"/>
+        </w:tabs>
+        <w:ind w:start="720" w:hanging="360"/>
+      </w:pPr>
+      <w:rPr/>
+    </w:lvl>
+    <w:lvl w:ilvl="1">
+      <w:start w:val="1"/>
+      <w:numFmt w:val="upperLetter"/>
+      <w:lvlText w:val="%2)"/>
+      <w:lvlJc w:val="start"/>
+      <w:pPr>
+        <w:tabs>
+          <w:tab w:val="num" w:pos="1080"/>
+        </w:tabs>
+        <w:ind w:start="1080" w:hanging="360"/>
+      </w:pPr>
+      <w:rPr/>
+    </w:lvl>
+    <w:lvl w:ilvl="2">
+      <w:start w:val="1"/>
+      <w:numFmt w:val="upperLetter"/>
+      <w:lvlText w:val="%3)"/>
+      <w:lvlJc w:val="start"/>
+      <w:pPr>
+        <w:tabs>
+          <w:tab w:val="num" w:pos="1440"/>
+        </w:tabs>
+        <w:ind w:start="1440" w:hanging="360"/>
+      </w:pPr>
+      <w:rPr/>
+    </w:lvl>
+    <w:lvl w:ilvl="3">
+      <w:start w:val="1"/>
+      <w:numFmt w:val="upperLetter"/>
+      <w:lvlText w:val="%4)"/>
+      <w:lvlJc w:val="start"/>
+      <w:pPr>
+        <w:tabs>
+          <w:tab w:val="num" w:pos="1800"/>
+        </w:tabs>
+        <w:ind w:start="1800" w:hanging="360"/>
+      </w:pPr>
+      <w:rPr/>
+    </w:lvl>
+    <w:lvl w:ilvl="4">
+      <w:start w:val="1"/>
+      <w:numFmt w:val="upperLetter"/>
+      <w:lvlText w:val="%5)"/>
+      <w:lvlJc w:val="start"/>
+      <w:pPr>
+        <w:tabs>
+          <w:tab w:val="num" w:pos="2160"/>
+        </w:tabs>
+        <w:ind w:start="2160" w:hanging="360"/>
+      </w:pPr>
+      <w:rPr/>
+    </w:lvl>
+    <w:lvl w:ilvl="5">
+      <w:start w:val="1"/>
+      <w:numFmt w:val="upperLetter"/>
+      <w:lvlText w:val="%6)"/>
+      <w:lvlJc w:val="start"/>
+      <w:pPr>
+        <w:tabs>
+          <w:tab w:val="num" w:pos="2520"/>
+        </w:tabs>
+        <w:ind w:start="2520" w:hanging="360"/>
+      </w:pPr>
+      <w:rPr/>
+    </w:lvl>
+    <w:lvl w:ilvl="6">
+      <w:start w:val="1"/>
+      <w:numFmt w:val="upperLetter"/>
+      <w:lvlText w:val="%7)"/>
+      <w:lvlJc w:val="start"/>
+      <w:pPr>
+        <w:tabs>
+          <w:tab w:val="num" w:pos="2880"/>
+        </w:tabs>
+        <w:ind w:start="2880" w:hanging="360"/>
+      </w:pPr>
+      <w:rPr/>
+    </w:lvl>
+    <w:lvl w:ilvl="7">
+      <w:start w:val="1"/>
+      <w:numFmt w:val="upperLetter"/>
+      <w:lvlText w:val="%8)"/>
+      <w:lvlJc w:val="start"/>
+      <w:pPr>
+        <w:tabs>
+          <w:tab w:val="num" w:pos="3240"/>
+        </w:tabs>
+        <w:ind w:start="3240" w:hanging="360"/>
+      </w:pPr>
+      <w:rPr/>
+    </w:lvl>
+    <w:lvl w:ilvl="8">
+      <w:start w:val="1"/>
+      <w:numFmt w:val="upperLetter"/>
+      <w:lvlText w:val="%9)"/>
+      <w:lvlJc w:val="start"/>
+      <w:pPr>
+        <w:tabs>
+          <w:tab w:val="num" w:pos="3600"/>
+        </w:tabs>
+        <w:ind w:start="3600" w:hanging="360"/>
+      </w:pPr>
+      <w:rPr/>
+    </w:lvl>
+  </w:abstractNum>
+  <w:abstractNum w:abstractNumId="8">
+    <w:lvl w:ilvl="0">
+      <w:start w:val="1"/>
+      <w:numFmt w:val="bullet"/>
+      <w:lvlText w:val=""/>
+      <w:lvlJc w:val="start"/>
+      <w:pPr>
+        <w:tabs>
+          <w:tab w:val="num" w:pos="1429"/>
+        </w:tabs>
+        <w:ind w:start="1429" w:hanging="360"/>
+      </w:pPr>
+      <w:rPr>
+        <w:rFonts w:ascii="Symbol" w:hAnsi="Symbol" w:cs="Symbol" w:hint="default"/>
+      </w:rPr>
+    </w:lvl>
+    <w:lvl w:ilvl="1">
+      <w:start w:val="1"/>
+      <w:numFmt w:val="bullet"/>
+      <w:lvlText w:val="◦"/>
+      <w:lvlJc w:val="start"/>
+      <w:pPr>
+        <w:tabs>
+          <w:tab w:val="num" w:pos="1789"/>
+        </w:tabs>
+        <w:ind w:start="1789" w:hanging="360"/>
+      </w:pPr>
+      <w:rPr>
+        <w:rFonts w:ascii="OpenSymbol" w:hAnsi="OpenSymbol" w:cs="OpenSymbol" w:hint="default"/>
+      </w:rPr>
+    </w:lvl>
+    <w:lvl w:ilvl="2">
+      <w:start w:val="1"/>
+      <w:numFmt w:val="bullet"/>
+      <w:lvlText w:val="▪"/>
+      <w:lvlJc w:val="start"/>
+      <w:pPr>
+        <w:tabs>
+          <w:tab w:val="num" w:pos="2149"/>
+        </w:tabs>
+        <w:ind w:start="2149" w:hanging="360"/>
+      </w:pPr>
+      <w:rPr>
+        <w:rFonts w:ascii="OpenSymbol" w:hAnsi="OpenSymbol" w:cs="OpenSymbol" w:hint="default"/>
+      </w:rPr>
+    </w:lvl>
+    <w:lvl w:ilvl="3">
+      <w:start w:val="1"/>
+      <w:numFmt w:val="bullet"/>
+      <w:lvlText w:val=""/>
+      <w:lvlJc w:val="start"/>
+      <w:pPr>
+        <w:tabs>
+          <w:tab w:val="num" w:pos="2509"/>
+        </w:tabs>
+        <w:ind w:start="2509" w:hanging="360"/>
+      </w:pPr>
+      <w:rPr>
+        <w:rFonts w:ascii="Symbol" w:hAnsi="Symbol" w:cs="Symbol" w:hint="default"/>
+      </w:rPr>
+    </w:lvl>
+    <w:lvl w:ilvl="4">
+      <w:start w:val="1"/>
+      <w:numFmt w:val="bullet"/>
+      <w:lvlText w:val="◦"/>
+      <w:lvlJc w:val="start"/>
+      <w:pPr>
+        <w:tabs>
+          <w:tab w:val="num" w:pos="2869"/>
+        </w:tabs>
+        <w:ind w:start="2869" w:hanging="360"/>
+      </w:pPr>
+      <w:rPr>
+        <w:rFonts w:ascii="OpenSymbol" w:hAnsi="OpenSymbol" w:cs="OpenSymbol" w:hint="default"/>
+      </w:rPr>
+    </w:lvl>
+    <w:lvl w:ilvl="5">
+      <w:start w:val="1"/>
+      <w:numFmt w:val="bullet"/>
+      <w:lvlText w:val="▪"/>
+      <w:lvlJc w:val="start"/>
+      <w:pPr>
+        <w:tabs>
+          <w:tab w:val="num" w:pos="3229"/>
+        </w:tabs>
+        <w:ind w:start="3229" w:hanging="360"/>
+      </w:pPr>
+      <w:rPr>
+        <w:rFonts w:ascii="OpenSymbol" w:hAnsi="OpenSymbol" w:cs="OpenSymbol" w:hint="default"/>
+      </w:rPr>
+    </w:lvl>
+    <w:lvl w:ilvl="6">
+      <w:start w:val="1"/>
+      <w:numFmt w:val="bullet"/>
+      <w:lvlText w:val=""/>
+      <w:lvlJc w:val="start"/>
+      <w:pPr>
+        <w:tabs>
+          <w:tab w:val="num" w:pos="3589"/>
+        </w:tabs>
+        <w:ind w:start="3589" w:hanging="360"/>
+      </w:pPr>
+      <w:rPr>
+        <w:rFonts w:ascii="Symbol" w:hAnsi="Symbol" w:cs="Symbol" w:hint="default"/>
+      </w:rPr>
+    </w:lvl>
+    <w:lvl w:ilvl="7">
+      <w:start w:val="1"/>
+      <w:numFmt w:val="bullet"/>
+      <w:lvlText w:val="◦"/>
+      <w:lvlJc w:val="start"/>
+      <w:pPr>
+        <w:tabs>
+          <w:tab w:val="num" w:pos="3949"/>
+        </w:tabs>
+        <w:ind w:start="3949" w:hanging="360"/>
+      </w:pPr>
+      <w:rPr>
+        <w:rFonts w:ascii="OpenSymbol" w:hAnsi="OpenSymbol" w:cs="OpenSymbol" w:hint="default"/>
+      </w:rPr>
+    </w:lvl>
+    <w:lvl w:ilvl="8">
+      <w:start w:val="1"/>
+      <w:numFmt w:val="bullet"/>
+      <w:lvlText w:val="▪"/>
+      <w:lvlJc w:val="start"/>
+      <w:pPr>
+        <w:tabs>
+          <w:tab w:val="num" w:pos="4309"/>
+        </w:tabs>
+        <w:ind w:start="4309" w:hanging="360"/>
+      </w:pPr>
+      <w:rPr>
+        <w:rFonts w:ascii="OpenSymbol" w:hAnsi="OpenSymbol" w:cs="OpenSymbol" w:hint="default"/>
+      </w:rPr>
+    </w:lvl>
+  </w:abstractNum>
   <w:num w:numId="1">
     <w:abstractNumId w:val="1"/>
   </w:num>
@@ -5818,6 +6148,12 @@
   </w:num>
   <w:num w:numId="6">
     <w:abstractNumId w:val="6"/>
+  </w:num>
+  <w:num w:numId="7">
+    <w:abstractNumId w:val="7"/>
+  </w:num>
+  <w:num w:numId="8">
+    <w:abstractNumId w:val="8"/>
   </w:num>
 </w:numbering>
 </file>
@@ -6594,6 +6930,13 @@
     <w:qFormat/>
     <w:rPr/>
   </w:style>
+  <w:style w:type="character" w:styleId="Bullets">
+    <w:name w:val="Bullets"/>
+    <w:qFormat/>
+    <w:rPr>
+      <w:rFonts w:ascii="OpenSymbol" w:hAnsi="OpenSymbol" w:eastAsia="OpenSymbol" w:cs="OpenSymbol"/>
+    </w:rPr>
+  </w:style>
   <w:style w:type="paragraph" w:styleId="Heading">
     <w:name w:val="Heading"/>
     <w:basedOn w:val="Normal"/>

</xml_diff>

<commit_message>
added features to render, fixed uncontrolled inputs
</commit_message>
<xml_diff>
--- a/server/src/templates/offer.docx
+++ b/server/src/templates/offer.docx
@@ -486,7 +486,7 @@
       </w:tr>
       <w:tr>
         <w:trPr>
-          <w:trHeight w:val="926" w:hRule="atLeast"/>
+          <w:trHeight w:val="973" w:hRule="atLeast"/>
         </w:trPr>
         <w:tc>
           <w:tcPr>
@@ -1033,16 +1033,56 @@
           <w:numId w:val="8"/>
         </w:numPr>
         <w:rPr>
-          <w:b/>
-          <w:bCs/>
+          <w:b w:val="false"/>
+          <w:bCs w:val="false"/>
         </w:rPr>
       </w:pPr>
       <w:r>
         <w:rPr>
-          <w:b/>
-          <w:bCs/>
+          <w:b w:val="false"/>
+          <w:bCs w:val="false"/>
         </w:rPr>
-        <w:t>Datenaufbewahrung / max. Retention: unlimitiert</w:t>
+        <w:t>{#contract.features}</w:t>
+      </w:r>
+    </w:p>
+    <w:p>
+      <w:pPr>
+        <w:pStyle w:val="dignumStandardvor0nach0"/>
+        <w:numPr>
+          <w:ilvl w:val="1"/>
+          <w:numId w:val="8"/>
+        </w:numPr>
+        <w:rPr>
+          <w:b w:val="false"/>
+          <w:bCs w:val="false"/>
+        </w:rPr>
+      </w:pPr>
+      <w:r>
+        <w:rPr>
+          <w:b w:val="false"/>
+          <w:bCs w:val="false"/>
+        </w:rPr>
+        <w:t>{.}</w:t>
+      </w:r>
+    </w:p>
+    <w:p>
+      <w:pPr>
+        <w:pStyle w:val="dignumStandardvor0nach0"/>
+        <w:numPr>
+          <w:ilvl w:val="1"/>
+          <w:numId w:val="8"/>
+        </w:numPr>
+        <w:rPr>
+          <w:b w:val="false"/>
+          <w:bCs w:val="false"/>
+        </w:rPr>
+      </w:pPr>
+      <w:r>
+        <w:rPr>
+          <w:b w:val="false"/>
+          <w:bCs w:val="false"/>
+        </w:rPr>
+        <w:t>{/contract.features}</w:t>
       </w:r>
     </w:p>
     <w:p>

</xml_diff>